<commit_message>
Address submission reproducibility and QA
</commit_message>
<xml_diff>
--- a/evaluation/publication_results/manuscript_package_20260719/tirs_final_submission_package_20260720/submission_upload_files_20260720/00_Cover_Letter_TIRS_20260720.docx
+++ b/evaluation/publication_results/manuscript_package_20260719/tirs_final_submission_package_20260720/submission_upload_files_20260720/00_Cover_Letter_TIRS_20260720.docx
@@ -8,11 +8,11 @@
       </w:pPr>
       <w:r>
         <w:rPr>
-          <w:rFonts w:ascii="Arial" w:hAnsi="Arial" w:eastAsia="Arial"/>
+          <w:rFonts w:ascii="Times New Roman" w:hAnsi="Times New Roman" w:eastAsia="Times New Roman" w:cs="Times New Roman"/>
           <w:b w:val="0"/>
           <w:i w:val="0"/>
           <w:color w:val="000000"/>
-          <w:sz w:val="22"/>
+          <w:sz w:val="24"/>
         </w:rPr>
         <w:t>Dear Editor,</w:t>
       </w:r>
@@ -23,11 +23,11 @@
       </w:pPr>
       <w:r>
         <w:rPr>
-          <w:rFonts w:ascii="Arial" w:hAnsi="Arial" w:eastAsia="Arial"/>
+          <w:rFonts w:ascii="Times New Roman" w:hAnsi="Times New Roman" w:eastAsia="Times New Roman" w:cs="Times New Roman"/>
           <w:b w:val="0"/>
           <w:i w:val="0"/>
           <w:color w:val="000000"/>
-          <w:sz w:val="22"/>
+          <w:sz w:val="24"/>
         </w:rPr>
         <w:t>We are pleased to submit the manuscript "Bilingual Retrieval-Augmented Access to ANVISA Regulatory Documents: A Technical Evaluation Using Drug-Development and Health-Product Questions" for consideration as a Research Article in Therapeutic Innovation &amp; Regulatory Science.</w:t>
       </w:r>
@@ -38,11 +38,11 @@
       </w:pPr>
       <w:r>
         <w:rPr>
-          <w:rFonts w:ascii="Arial" w:hAnsi="Arial" w:eastAsia="Arial"/>
+          <w:rFonts w:ascii="Times New Roman" w:hAnsi="Times New Roman" w:eastAsia="Times New Roman" w:cs="Times New Roman"/>
           <w:b w:val="0"/>
           <w:i w:val="0"/>
           <w:color w:val="000000"/>
-          <w:sz w:val="22"/>
+          <w:sz w:val="24"/>
         </w:rPr>
         <w:t>This manuscript evaluates a bilingual retrieval-augmented generation prototype for article-level access to selected ANVISA regulatory documents. The study is framed as a technical regulatory-science evaluation, not as regulatory validation or a decision-support claim. The intended use is evidence navigation within a closed document set: helping users locate relevant document articles, summarize the answer, and refuse questions when the indexed corpus does not contain the requested information.</w:t>
       </w:r>
@@ -53,11 +53,11 @@
       </w:pPr>
       <w:r>
         <w:rPr>
-          <w:rFonts w:ascii="Arial" w:hAnsi="Arial" w:eastAsia="Arial"/>
+          <w:rFonts w:ascii="Times New Roman" w:hAnsi="Times New Roman" w:eastAsia="Times New Roman" w:cs="Times New Roman"/>
           <w:b w:val="0"/>
           <w:i w:val="0"/>
           <w:color w:val="000000"/>
-          <w:sz w:val="22"/>
+          <w:sz w:val="24"/>
         </w:rPr>
         <w:t>The work may be of interest to TIRS readers because it connects generative AI evaluation with practical regulatory activities in drug development, pharmacovigilance, biological products, medical devices, and reliance-based review. It also addresses a common cross-language situation: users may ask questions in English while the authoritative regulatory text is in Portuguese.</w:t>
       </w:r>
@@ -68,11 +68,11 @@
       </w:pPr>
       <w:r>
         <w:rPr>
-          <w:rFonts w:ascii="Arial" w:hAnsi="Arial" w:eastAsia="Arial"/>
+          <w:rFonts w:ascii="Times New Roman" w:hAnsi="Times New Roman" w:eastAsia="Times New Roman" w:cs="Times New Roman"/>
           <w:b w:val="0"/>
           <w:i w:val="0"/>
           <w:color w:val="000000"/>
-          <w:sz w:val="22"/>
+          <w:sz w:val="24"/>
         </w:rPr>
         <w:t>We include detailed supplementary methods, prompts, benchmark artifacts, per-question results, figure source tables, and checksums to support reproducibility and auditability. The code, benchmark manifests, generated outputs, prompts, and non-restricted derived artifacts will be made publicly available in a project repository after manuscript acceptance.</w:t>
       </w:r>
@@ -83,11 +83,11 @@
       </w:pPr>
       <w:r>
         <w:rPr>
-          <w:rFonts w:ascii="Arial" w:hAnsi="Arial" w:eastAsia="Arial"/>
+          <w:rFonts w:ascii="Times New Roman" w:hAnsi="Times New Roman" w:eastAsia="Times New Roman" w:cs="Times New Roman"/>
           <w:b w:val="0"/>
           <w:i w:val="0"/>
           <w:color w:val="000000"/>
-          <w:sz w:val="22"/>
+          <w:sz w:val="24"/>
         </w:rPr>
         <w:t>The authors declare no funding and no competing financial interests. Ethics approval was not required because the study used public regulatory documents and generated benchmark questions; no human participants, patient data, animal data, or clinical trial data were used.</w:t>
       </w:r>
@@ -98,11 +98,11 @@
       </w:pPr>
       <w:r>
         <w:rPr>
-          <w:rFonts w:ascii="Arial" w:hAnsi="Arial" w:eastAsia="Arial"/>
+          <w:rFonts w:ascii="Times New Roman" w:hAnsi="Times New Roman" w:eastAsia="Times New Roman" w:cs="Times New Roman"/>
           <w:b w:val="0"/>
           <w:i w:val="0"/>
           <w:color w:val="000000"/>
-          <w:sz w:val="22"/>
+          <w:sz w:val="24"/>
         </w:rPr>
         <w:t>Thank you for considering this manuscript.</w:t>
       </w:r>
@@ -113,11 +113,11 @@
       </w:pPr>
       <w:r>
         <w:rPr>
-          <w:rFonts w:ascii="Arial" w:hAnsi="Arial" w:eastAsia="Arial"/>
+          <w:rFonts w:ascii="Times New Roman" w:hAnsi="Times New Roman" w:eastAsia="Times New Roman" w:cs="Times New Roman"/>
           <w:b w:val="0"/>
           <w:i w:val="0"/>
           <w:color w:val="000000"/>
-          <w:sz w:val="22"/>
+          <w:sz w:val="24"/>
         </w:rPr>
         <w:t>Sincerely,</w:t>
       </w:r>
@@ -128,11 +128,11 @@
       </w:pPr>
       <w:r>
         <w:rPr>
-          <w:rFonts w:ascii="Arial" w:hAnsi="Arial" w:eastAsia="Arial"/>
+          <w:rFonts w:ascii="Times New Roman" w:hAnsi="Times New Roman" w:eastAsia="Times New Roman" w:cs="Times New Roman"/>
           <w:b w:val="0"/>
           <w:i w:val="0"/>
           <w:color w:val="000000"/>
-          <w:sz w:val="22"/>
+          <w:sz w:val="24"/>
         </w:rPr>
         <w:t>Carlos Victor Montefusco-Pereira</w:t>
       </w:r>
@@ -143,11 +143,11 @@
       </w:pPr>
       <w:r>
         <w:rPr>
-          <w:rFonts w:ascii="Arial" w:hAnsi="Arial" w:eastAsia="Arial"/>
+          <w:rFonts w:ascii="Times New Roman" w:hAnsi="Times New Roman" w:eastAsia="Times New Roman" w:cs="Times New Roman"/>
           <w:b w:val="0"/>
           <w:i w:val="0"/>
           <w:color w:val="000000"/>
-          <w:sz w:val="22"/>
+          <w:sz w:val="24"/>
         </w:rPr>
         <w:t>Corresponding author</w:t>
       </w:r>
@@ -158,16 +158,18 @@
       </w:pPr>
       <w:r>
         <w:rPr>
-          <w:rFonts w:ascii="Arial" w:hAnsi="Arial" w:eastAsia="Arial"/>
+          <w:rFonts w:ascii="Times New Roman" w:hAnsi="Times New Roman" w:eastAsia="Times New Roman" w:cs="Times New Roman"/>
           <w:b w:val="0"/>
           <w:i w:val="0"/>
           <w:color w:val="000000"/>
-          <w:sz w:val="22"/>
+          <w:sz w:val="24"/>
         </w:rPr>
         <w:t>cmontefusco@gmail.com</w:t>
       </w:r>
     </w:p>
     <w:sectPr>
+      <w:headerReference w:type="default" r:id="rId9"/>
+      <w:footerReference w:type="default" r:id="rId10"/>
       <w:pgSz w:w="12240" w:h="15840"/>
       <w:pgMar w:top="1440" w:right="1440" w:bottom="1440" w:left="1440" w:header="720" w:footer="720" w:gutter="0"/>
       <w:cols w:space="720"/>
@@ -175,6 +177,26 @@
     </w:sectPr>
   </w:body>
 </w:document>
+</file>
+
+<file path=word/footer1.xml><?xml version="1.0" encoding="utf-8"?>
+<w:ftr xmlns:m="http://schemas.openxmlformats.org/officeDocument/2006/math" xmlns:mc="http://schemas.openxmlformats.org/markup-compatibility/2006" xmlns:mo="http://schemas.microsoft.com/office/mac/office/2008/main" xmlns:mv="urn:schemas-microsoft-com:mac:vml" xmlns:o="urn:schemas-microsoft-com:office:office" xmlns:r="http://schemas.openxmlformats.org/officeDocument/2006/relationships" xmlns:v="urn:schemas-microsoft-com:vml" xmlns:w10="urn:schemas-microsoft-com:office:word" xmlns:w14="http://schemas.microsoft.com/office/word/2010/wordml" xmlns:w="http://schemas.openxmlformats.org/wordprocessingml/2006/main" xmlns:wne="http://schemas.microsoft.com/office/word/2006/wordml" xmlns:wp14="http://schemas.microsoft.com/office/word/2010/wordprocessingDrawing" xmlns:wp="http://schemas.openxmlformats.org/drawingml/2006/wordprocessingDrawing" xmlns:wpc="http://schemas.microsoft.com/office/word/2010/wordprocessingCanvas" xmlns:wpg="http://schemas.microsoft.com/office/word/2010/wordprocessingGroup" xmlns:wpi="http://schemas.microsoft.com/office/word/2010/wordprocessingInk" xmlns:wps="http://schemas.microsoft.com/office/word/2010/wordprocessingShape" mc:Ignorable="w14 wp14">
+  <w:p>
+    <w:pPr>
+      <w:pStyle w:val="Footer"/>
+    </w:pPr>
+  </w:p>
+</w:ftr>
+</file>
+
+<file path=word/header1.xml><?xml version="1.0" encoding="utf-8"?>
+<w:hdr xmlns:m="http://schemas.openxmlformats.org/officeDocument/2006/math" xmlns:mc="http://schemas.openxmlformats.org/markup-compatibility/2006" xmlns:mo="http://schemas.microsoft.com/office/mac/office/2008/main" xmlns:mv="urn:schemas-microsoft-com:mac:vml" xmlns:o="urn:schemas-microsoft-com:office:office" xmlns:r="http://schemas.openxmlformats.org/officeDocument/2006/relationships" xmlns:v="urn:schemas-microsoft-com:vml" xmlns:w10="urn:schemas-microsoft-com:office:word" xmlns:w14="http://schemas.microsoft.com/office/word/2010/wordml" xmlns:w="http://schemas.openxmlformats.org/wordprocessingml/2006/main" xmlns:wne="http://schemas.microsoft.com/office/word/2006/wordml" xmlns:wp14="http://schemas.microsoft.com/office/word/2010/wordprocessingDrawing" xmlns:wp="http://schemas.openxmlformats.org/drawingml/2006/wordprocessingDrawing" xmlns:wpc="http://schemas.microsoft.com/office/word/2010/wordprocessingCanvas" xmlns:wpg="http://schemas.microsoft.com/office/word/2010/wordprocessingGroup" xmlns:wpi="http://schemas.microsoft.com/office/word/2010/wordprocessingInk" xmlns:wps="http://schemas.microsoft.com/office/word/2010/wordprocessingShape" mc:Ignorable="w14 wp14">
+  <w:p>
+    <w:pPr>
+      <w:pStyle w:val="Header"/>
+    </w:pPr>
+  </w:p>
+</w:hdr>
 </file>
 
 <file path=word/numbering.xml><?xml version="1.0" encoding="utf-8"?>
@@ -541,9 +563,9 @@
     <w:qFormat/>
     <w:rsid w:val="00FC693F"/>
     <w:rPr>
-      <w:rFonts w:ascii="Arial" w:hAnsi="Arial" w:eastAsia="Arial"/>
+      <w:rFonts w:ascii="Times New Roman" w:hAnsi="Times New Roman" w:eastAsia="Times New Roman" w:cs="Times New Roman"/>
       <w:color w:val="000000"/>
-      <w:sz w:val="22"/>
+      <w:sz w:val="24"/>
     </w:rPr>
   </w:style>
   <w:style w:type="paragraph" w:styleId="Header">
@@ -560,6 +582,11 @@
       </w:tabs>
       <w:spacing w:after="0" w:line="240" w:lineRule="auto"/>
     </w:pPr>
+    <w:rPr>
+      <w:rFonts w:ascii="Times New Roman" w:hAnsi="Times New Roman" w:eastAsia="Times New Roman" w:cs="Times New Roman"/>
+      <w:color w:val="000000"/>
+      <w:sz w:val="24"/>
+    </w:rPr>
   </w:style>
   <w:style w:type="character" w:customStyle="1" w:styleId="HeaderChar">
     <w:name w:val="Header Char"/>
@@ -567,6 +594,11 @@
     <w:link w:val="Header"/>
     <w:uiPriority w:val="99"/>
     <w:rsid w:val="00E618BF"/>
+    <w:rPr>
+      <w:rFonts w:ascii="Times New Roman" w:hAnsi="Times New Roman" w:eastAsia="Times New Roman" w:cs="Times New Roman"/>
+      <w:color w:val="000000"/>
+      <w:sz w:val="24"/>
+    </w:rPr>
   </w:style>
   <w:style w:type="paragraph" w:styleId="Footer">
     <w:name w:val="footer"/>
@@ -582,6 +614,11 @@
       </w:tabs>
       <w:spacing w:after="0" w:line="240" w:lineRule="auto"/>
     </w:pPr>
+    <w:rPr>
+      <w:rFonts w:ascii="Times New Roman" w:hAnsi="Times New Roman" w:eastAsia="Times New Roman" w:cs="Times New Roman"/>
+      <w:color w:val="000000"/>
+      <w:sz w:val="24"/>
+    </w:rPr>
   </w:style>
   <w:style w:type="character" w:customStyle="1" w:styleId="FooterChar">
     <w:name w:val="Footer Char"/>
@@ -589,6 +626,11 @@
     <w:link w:val="Footer"/>
     <w:uiPriority w:val="99"/>
     <w:rsid w:val="00E618BF"/>
+    <w:rPr>
+      <w:rFonts w:ascii="Times New Roman" w:hAnsi="Times New Roman" w:eastAsia="Times New Roman" w:cs="Times New Roman"/>
+      <w:color w:val="000000"/>
+      <w:sz w:val="24"/>
+    </w:rPr>
   </w:style>
   <w:style w:type="paragraph" w:styleId="Heading1">
     <w:name w:val="heading 1"/>
@@ -605,11 +647,11 @@
       <w:outlineLvl w:val="0"/>
     </w:pPr>
     <w:rPr>
-      <w:rFonts w:asciiTheme="majorHAnsi" w:eastAsiaTheme="majorEastAsia" w:hAnsiTheme="majorHAnsi" w:cstheme="majorBidi" w:ascii="Arial" w:hAnsi="Arial" w:eastAsia="Arial"/>
+      <w:rFonts w:asciiTheme="majorHAnsi" w:eastAsiaTheme="majorEastAsia" w:hAnsiTheme="majorHAnsi" w:cstheme="majorBidi" w:ascii="Times New Roman" w:hAnsi="Times New Roman" w:eastAsia="Times New Roman" w:cs="Times New Roman"/>
       <w:b w:val="0"/>
       <w:bCs/>
       <w:color w:val="000000"/>
-      <w:sz w:val="36"/>
+      <w:sz w:val="24"/>
       <w:szCs w:val="28"/>
     </w:rPr>
   </w:style>
@@ -629,11 +671,11 @@
       <w:outlineLvl w:val="1"/>
     </w:pPr>
     <w:rPr>
-      <w:rFonts w:asciiTheme="majorHAnsi" w:eastAsiaTheme="majorEastAsia" w:hAnsiTheme="majorHAnsi" w:cstheme="majorBidi" w:ascii="Arial" w:hAnsi="Arial" w:eastAsia="Arial"/>
+      <w:rFonts w:asciiTheme="majorHAnsi" w:eastAsiaTheme="majorEastAsia" w:hAnsiTheme="majorHAnsi" w:cstheme="majorBidi" w:ascii="Times New Roman" w:hAnsi="Times New Roman" w:eastAsia="Times New Roman" w:cs="Times New Roman"/>
       <w:b w:val="0"/>
       <w:bCs/>
       <w:color w:val="000000"/>
-      <w:sz w:val="28"/>
+      <w:sz w:val="24"/>
       <w:szCs w:val="26"/>
     </w:rPr>
   </w:style>
@@ -653,7 +695,7 @@
       <w:outlineLvl w:val="2"/>
     </w:pPr>
     <w:rPr>
-      <w:rFonts w:asciiTheme="majorHAnsi" w:eastAsiaTheme="majorEastAsia" w:hAnsiTheme="majorHAnsi" w:cstheme="majorBidi" w:ascii="Arial" w:hAnsi="Arial" w:eastAsia="Arial"/>
+      <w:rFonts w:asciiTheme="majorHAnsi" w:eastAsiaTheme="majorEastAsia" w:hAnsiTheme="majorHAnsi" w:cstheme="majorBidi" w:ascii="Times New Roman" w:hAnsi="Times New Roman" w:eastAsia="Times New Roman" w:cs="Times New Roman"/>
       <w:b w:val="0"/>
       <w:bCs/>
       <w:color w:val="000000"/>
@@ -677,12 +719,13 @@
       <w:outlineLvl w:val="3"/>
     </w:pPr>
     <w:rPr>
-      <w:rFonts w:asciiTheme="majorHAnsi" w:eastAsiaTheme="majorEastAsia" w:hAnsiTheme="majorHAnsi" w:cstheme="majorBidi"/>
+      <w:rFonts w:asciiTheme="majorHAnsi" w:eastAsiaTheme="majorEastAsia" w:hAnsiTheme="majorHAnsi" w:cstheme="majorBidi" w:ascii="Times New Roman" w:hAnsi="Times New Roman" w:eastAsia="Times New Roman" w:cs="Times New Roman"/>
       <w:b/>
       <w:bCs/>
       <w:i/>
       <w:iCs/>
-      <w:color w:val="4F81BD" w:themeColor="accent1"/>
+      <w:color w:val="000000"/>
+      <w:sz w:val="24"/>
     </w:rPr>
   </w:style>
   <w:style w:type="paragraph" w:styleId="Heading5">
@@ -702,8 +745,9 @@
       <w:outlineLvl w:val="4"/>
     </w:pPr>
     <w:rPr>
-      <w:rFonts w:asciiTheme="majorHAnsi" w:eastAsiaTheme="majorEastAsia" w:hAnsiTheme="majorHAnsi" w:cstheme="majorBidi"/>
-      <w:color w:val="243F60" w:themeColor="accent1" w:themeShade="7F"/>
+      <w:rFonts w:asciiTheme="majorHAnsi" w:eastAsiaTheme="majorEastAsia" w:hAnsiTheme="majorHAnsi" w:cstheme="majorBidi" w:ascii="Times New Roman" w:hAnsi="Times New Roman" w:eastAsia="Times New Roman" w:cs="Times New Roman"/>
+      <w:color w:val="000000"/>
+      <w:sz w:val="24"/>
     </w:rPr>
   </w:style>
   <w:style w:type="paragraph" w:styleId="Heading6">
@@ -723,10 +767,11 @@
       <w:outlineLvl w:val="5"/>
     </w:pPr>
     <w:rPr>
-      <w:rFonts w:asciiTheme="majorHAnsi" w:eastAsiaTheme="majorEastAsia" w:hAnsiTheme="majorHAnsi" w:cstheme="majorBidi"/>
+      <w:rFonts w:asciiTheme="majorHAnsi" w:eastAsiaTheme="majorEastAsia" w:hAnsiTheme="majorHAnsi" w:cstheme="majorBidi" w:ascii="Times New Roman" w:hAnsi="Times New Roman" w:eastAsia="Times New Roman" w:cs="Times New Roman"/>
       <w:i/>
       <w:iCs/>
-      <w:color w:val="243F60" w:themeColor="accent1" w:themeShade="7F"/>
+      <w:color w:val="000000"/>
+      <w:sz w:val="24"/>
     </w:rPr>
   </w:style>
   <w:style w:type="paragraph" w:styleId="Heading7">
@@ -746,10 +791,11 @@
       <w:outlineLvl w:val="6"/>
     </w:pPr>
     <w:rPr>
-      <w:rFonts w:asciiTheme="majorHAnsi" w:eastAsiaTheme="majorEastAsia" w:hAnsiTheme="majorHAnsi" w:cstheme="majorBidi"/>
+      <w:rFonts w:asciiTheme="majorHAnsi" w:eastAsiaTheme="majorEastAsia" w:hAnsiTheme="majorHAnsi" w:cstheme="majorBidi" w:ascii="Times New Roman" w:hAnsi="Times New Roman" w:eastAsia="Times New Roman" w:cs="Times New Roman"/>
       <w:i/>
       <w:iCs/>
-      <w:color w:val="404040" w:themeColor="text1" w:themeTint="BF"/>
+      <w:color w:val="000000"/>
+      <w:sz w:val="24"/>
     </w:rPr>
   </w:style>
   <w:style w:type="paragraph" w:styleId="Heading8">
@@ -769,9 +815,9 @@
       <w:outlineLvl w:val="7"/>
     </w:pPr>
     <w:rPr>
-      <w:rFonts w:asciiTheme="majorHAnsi" w:eastAsiaTheme="majorEastAsia" w:hAnsiTheme="majorHAnsi" w:cstheme="majorBidi"/>
-      <w:color w:val="4F81BD" w:themeColor="accent1"/>
-      <w:sz w:val="20"/>
+      <w:rFonts w:asciiTheme="majorHAnsi" w:eastAsiaTheme="majorEastAsia" w:hAnsiTheme="majorHAnsi" w:cstheme="majorBidi" w:ascii="Times New Roman" w:hAnsi="Times New Roman" w:eastAsia="Times New Roman" w:cs="Times New Roman"/>
+      <w:color w:val="000000"/>
+      <w:sz w:val="24"/>
       <w:szCs w:val="20"/>
     </w:rPr>
   </w:style>
@@ -792,11 +838,11 @@
       <w:outlineLvl w:val="8"/>
     </w:pPr>
     <w:rPr>
-      <w:rFonts w:asciiTheme="majorHAnsi" w:eastAsiaTheme="majorEastAsia" w:hAnsiTheme="majorHAnsi" w:cstheme="majorBidi"/>
+      <w:rFonts w:asciiTheme="majorHAnsi" w:eastAsiaTheme="majorEastAsia" w:hAnsiTheme="majorHAnsi" w:cstheme="majorBidi" w:ascii="Times New Roman" w:hAnsi="Times New Roman" w:eastAsia="Times New Roman" w:cs="Times New Roman"/>
       <w:i/>
       <w:iCs/>
-      <w:color w:val="404040" w:themeColor="text1" w:themeTint="BF"/>
-      <w:sz w:val="20"/>
+      <w:color w:val="000000"/>
+      <w:sz w:val="24"/>
       <w:szCs w:val="20"/>
     </w:rPr>
   </w:style>
@@ -805,6 +851,11 @@
     <w:uiPriority w:val="1"/>
     <w:semiHidden/>
     <w:unhideWhenUsed/>
+    <w:rPr>
+      <w:rFonts w:ascii="Times New Roman" w:hAnsi="Times New Roman" w:eastAsia="Times New Roman" w:cs="Times New Roman"/>
+      <w:color w:val="000000"/>
+      <w:sz w:val="24"/>
+    </w:rPr>
   </w:style>
   <w:style w:type="table" w:default="1" w:styleId="TableNormal">
     <w:name w:val="Normal Table"/>
@@ -835,6 +886,11 @@
     <w:pPr>
       <w:spacing w:after="0" w:line="240" w:lineRule="auto"/>
     </w:pPr>
+    <w:rPr>
+      <w:rFonts w:ascii="Times New Roman" w:hAnsi="Times New Roman" w:eastAsia="Times New Roman" w:cs="Times New Roman"/>
+      <w:color w:val="000000"/>
+      <w:sz w:val="24"/>
+    </w:rPr>
   </w:style>
   <w:style w:type="character" w:customStyle="1" w:styleId="Heading1Char">
     <w:name w:val="Heading 1 Char"/>
@@ -843,11 +899,11 @@
     <w:uiPriority w:val="9"/>
     <w:rsid w:val="00FC693F"/>
     <w:rPr>
-      <w:rFonts w:asciiTheme="majorHAnsi" w:eastAsiaTheme="majorEastAsia" w:hAnsiTheme="majorHAnsi" w:cstheme="majorBidi"/>
+      <w:rFonts w:asciiTheme="majorHAnsi" w:eastAsiaTheme="majorEastAsia" w:hAnsiTheme="majorHAnsi" w:cstheme="majorBidi" w:ascii="Times New Roman" w:hAnsi="Times New Roman" w:eastAsia="Times New Roman" w:cs="Times New Roman"/>
       <w:b/>
       <w:bCs/>
-      <w:color w:val="365F91" w:themeColor="accent1" w:themeShade="BF"/>
-      <w:sz w:val="28"/>
+      <w:color w:val="000000"/>
+      <w:sz w:val="24"/>
       <w:szCs w:val="28"/>
     </w:rPr>
   </w:style>
@@ -858,11 +914,11 @@
     <w:uiPriority w:val="9"/>
     <w:rsid w:val="00FC693F"/>
     <w:rPr>
-      <w:rFonts w:asciiTheme="majorHAnsi" w:eastAsiaTheme="majorEastAsia" w:hAnsiTheme="majorHAnsi" w:cstheme="majorBidi"/>
+      <w:rFonts w:asciiTheme="majorHAnsi" w:eastAsiaTheme="majorEastAsia" w:hAnsiTheme="majorHAnsi" w:cstheme="majorBidi" w:ascii="Times New Roman" w:hAnsi="Times New Roman" w:eastAsia="Times New Roman" w:cs="Times New Roman"/>
       <w:b/>
       <w:bCs/>
-      <w:color w:val="4F81BD" w:themeColor="accent1"/>
-      <w:sz w:val="26"/>
+      <w:color w:val="000000"/>
+      <w:sz w:val="24"/>
       <w:szCs w:val="26"/>
     </w:rPr>
   </w:style>
@@ -873,10 +929,11 @@
     <w:uiPriority w:val="9"/>
     <w:rsid w:val="00FC693F"/>
     <w:rPr>
-      <w:rFonts w:asciiTheme="majorHAnsi" w:eastAsiaTheme="majorEastAsia" w:hAnsiTheme="majorHAnsi" w:cstheme="majorBidi"/>
+      <w:rFonts w:asciiTheme="majorHAnsi" w:eastAsiaTheme="majorEastAsia" w:hAnsiTheme="majorHAnsi" w:cstheme="majorBidi" w:ascii="Times New Roman" w:hAnsi="Times New Roman" w:eastAsia="Times New Roman" w:cs="Times New Roman"/>
       <w:b/>
       <w:bCs/>
-      <w:color w:val="4F81BD" w:themeColor="accent1"/>
+      <w:color w:val="000000"/>
+      <w:sz w:val="24"/>
     </w:rPr>
   </w:style>
   <w:style w:type="paragraph" w:styleId="Title">
@@ -895,11 +952,11 @@
       <w:contextualSpacing/>
     </w:pPr>
     <w:rPr>
-      <w:rFonts w:asciiTheme="majorHAnsi" w:eastAsiaTheme="majorEastAsia" w:hAnsiTheme="majorHAnsi" w:cstheme="majorBidi"/>
-      <w:color w:val="17365D" w:themeColor="text2" w:themeShade="BF"/>
+      <w:rFonts w:asciiTheme="majorHAnsi" w:eastAsiaTheme="majorEastAsia" w:hAnsiTheme="majorHAnsi" w:cstheme="majorBidi" w:ascii="Times New Roman" w:hAnsi="Times New Roman" w:eastAsia="Times New Roman" w:cs="Times New Roman"/>
+      <w:color w:val="000000"/>
       <w:spacing w:val="5"/>
       <w:kern w:val="28"/>
-      <w:sz w:val="52"/>
+      <w:sz w:val="24"/>
       <w:szCs w:val="52"/>
     </w:rPr>
   </w:style>
@@ -910,11 +967,11 @@
     <w:uiPriority w:val="10"/>
     <w:rsid w:val="00FC693F"/>
     <w:rPr>
-      <w:rFonts w:asciiTheme="majorHAnsi" w:eastAsiaTheme="majorEastAsia" w:hAnsiTheme="majorHAnsi" w:cstheme="majorBidi"/>
-      <w:color w:val="17365D" w:themeColor="text2" w:themeShade="BF"/>
+      <w:rFonts w:asciiTheme="majorHAnsi" w:eastAsiaTheme="majorEastAsia" w:hAnsiTheme="majorHAnsi" w:cstheme="majorBidi" w:ascii="Times New Roman" w:hAnsi="Times New Roman" w:eastAsia="Times New Roman" w:cs="Times New Roman"/>
+      <w:color w:val="000000"/>
       <w:spacing w:val="5"/>
       <w:kern w:val="28"/>
-      <w:sz w:val="52"/>
+      <w:sz w:val="24"/>
       <w:szCs w:val="52"/>
     </w:rPr>
   </w:style>
@@ -932,10 +989,10 @@
       </w:numPr>
     </w:pPr>
     <w:rPr>
-      <w:rFonts w:asciiTheme="majorHAnsi" w:eastAsiaTheme="majorEastAsia" w:hAnsiTheme="majorHAnsi" w:cstheme="majorBidi"/>
+      <w:rFonts w:asciiTheme="majorHAnsi" w:eastAsiaTheme="majorEastAsia" w:hAnsiTheme="majorHAnsi" w:cstheme="majorBidi" w:ascii="Times New Roman" w:hAnsi="Times New Roman" w:eastAsia="Times New Roman" w:cs="Times New Roman"/>
       <w:i/>
       <w:iCs/>
-      <w:color w:val="4F81BD" w:themeColor="accent1"/>
+      <w:color w:val="000000"/>
       <w:spacing w:val="15"/>
       <w:sz w:val="24"/>
       <w:szCs w:val="24"/>
@@ -948,10 +1005,10 @@
     <w:uiPriority w:val="11"/>
     <w:rsid w:val="00FC693F"/>
     <w:rPr>
-      <w:rFonts w:asciiTheme="majorHAnsi" w:eastAsiaTheme="majorEastAsia" w:hAnsiTheme="majorHAnsi" w:cstheme="majorBidi"/>
+      <w:rFonts w:asciiTheme="majorHAnsi" w:eastAsiaTheme="majorEastAsia" w:hAnsiTheme="majorHAnsi" w:cstheme="majorBidi" w:ascii="Times New Roman" w:hAnsi="Times New Roman" w:eastAsia="Times New Roman" w:cs="Times New Roman"/>
       <w:i/>
       <w:iCs/>
-      <w:color w:val="4F81BD" w:themeColor="accent1"/>
+      <w:color w:val="000000"/>
       <w:spacing w:val="15"/>
       <w:sz w:val="24"/>
       <w:szCs w:val="24"/>
@@ -967,6 +1024,11 @@
       <w:ind w:left="720"/>
       <w:contextualSpacing/>
     </w:pPr>
+    <w:rPr>
+      <w:rFonts w:ascii="Times New Roman" w:hAnsi="Times New Roman" w:eastAsia="Times New Roman" w:cs="Times New Roman"/>
+      <w:color w:val="000000"/>
+      <w:sz w:val="24"/>
+    </w:rPr>
   </w:style>
   <w:style w:type="paragraph" w:styleId="BodyText">
     <w:name w:val="Body Text"/>
@@ -978,6 +1040,11 @@
     <w:pPr>
       <w:spacing w:after="120"/>
     </w:pPr>
+    <w:rPr>
+      <w:rFonts w:ascii="Times New Roman" w:hAnsi="Times New Roman" w:eastAsia="Times New Roman" w:cs="Times New Roman"/>
+      <w:color w:val="000000"/>
+      <w:sz w:val="24"/>
+    </w:rPr>
   </w:style>
   <w:style w:type="character" w:customStyle="1" w:styleId="BodyTextChar">
     <w:name w:val="Body Text Char"/>
@@ -985,6 +1052,11 @@
     <w:link w:val="BodyText"/>
     <w:uiPriority w:val="99"/>
     <w:rsid w:val="00AA1D8D"/>
+    <w:rPr>
+      <w:rFonts w:ascii="Times New Roman" w:hAnsi="Times New Roman" w:eastAsia="Times New Roman" w:cs="Times New Roman"/>
+      <w:color w:val="000000"/>
+      <w:sz w:val="24"/>
+    </w:rPr>
   </w:style>
   <w:style w:type="paragraph" w:styleId="BodyText2">
     <w:name w:val="Body Text 2"/>
@@ -996,6 +1068,11 @@
     <w:pPr>
       <w:spacing w:after="120" w:line="480" w:lineRule="auto"/>
     </w:pPr>
+    <w:rPr>
+      <w:rFonts w:ascii="Times New Roman" w:hAnsi="Times New Roman" w:eastAsia="Times New Roman" w:cs="Times New Roman"/>
+      <w:color w:val="000000"/>
+      <w:sz w:val="24"/>
+    </w:rPr>
   </w:style>
   <w:style w:type="character" w:customStyle="1" w:styleId="BodyText2Char">
     <w:name w:val="Body Text 2 Char"/>
@@ -1003,6 +1080,11 @@
     <w:link w:val="BodyText2"/>
     <w:uiPriority w:val="99"/>
     <w:rsid w:val="00AA1D8D"/>
+    <w:rPr>
+      <w:rFonts w:ascii="Times New Roman" w:hAnsi="Times New Roman" w:eastAsia="Times New Roman" w:cs="Times New Roman"/>
+      <w:color w:val="000000"/>
+      <w:sz w:val="24"/>
+    </w:rPr>
   </w:style>
   <w:style w:type="paragraph" w:styleId="BodyText3">
     <w:name w:val="Body Text 3"/>
@@ -1015,7 +1097,9 @@
       <w:spacing w:after="120"/>
     </w:pPr>
     <w:rPr>
-      <w:sz w:val="16"/>
+      <w:rFonts w:ascii="Times New Roman" w:hAnsi="Times New Roman" w:eastAsia="Times New Roman" w:cs="Times New Roman"/>
+      <w:color w:val="000000"/>
+      <w:sz w:val="24"/>
       <w:szCs w:val="16"/>
     </w:rPr>
   </w:style>
@@ -1026,7 +1110,9 @@
     <w:uiPriority w:val="99"/>
     <w:rsid w:val="00AA1D8D"/>
     <w:rPr>
-      <w:sz w:val="16"/>
+      <w:rFonts w:ascii="Times New Roman" w:hAnsi="Times New Roman" w:eastAsia="Times New Roman" w:cs="Times New Roman"/>
+      <w:color w:val="000000"/>
+      <w:sz w:val="24"/>
       <w:szCs w:val="16"/>
     </w:rPr>
   </w:style>
@@ -1040,6 +1126,11 @@
       <w:ind w:left="360" w:hanging="360"/>
       <w:contextualSpacing/>
     </w:pPr>
+    <w:rPr>
+      <w:rFonts w:ascii="Times New Roman" w:hAnsi="Times New Roman" w:eastAsia="Times New Roman" w:cs="Times New Roman"/>
+      <w:color w:val="000000"/>
+      <w:sz w:val="24"/>
+    </w:rPr>
   </w:style>
   <w:style w:type="paragraph" w:styleId="List2">
     <w:name w:val="List 2"/>
@@ -1051,6 +1142,11 @@
       <w:ind w:left="720" w:hanging="360"/>
       <w:contextualSpacing/>
     </w:pPr>
+    <w:rPr>
+      <w:rFonts w:ascii="Times New Roman" w:hAnsi="Times New Roman" w:eastAsia="Times New Roman" w:cs="Times New Roman"/>
+      <w:color w:val="000000"/>
+      <w:sz w:val="24"/>
+    </w:rPr>
   </w:style>
   <w:style w:type="paragraph" w:styleId="List3">
     <w:name w:val="List 3"/>
@@ -1062,6 +1158,11 @@
       <w:ind w:left="1080" w:hanging="360"/>
       <w:contextualSpacing/>
     </w:pPr>
+    <w:rPr>
+      <w:rFonts w:ascii="Times New Roman" w:hAnsi="Times New Roman" w:eastAsia="Times New Roman" w:cs="Times New Roman"/>
+      <w:color w:val="000000"/>
+      <w:sz w:val="24"/>
+    </w:rPr>
   </w:style>
   <w:style w:type="paragraph" w:styleId="ListBullet">
     <w:name w:val="List Bullet"/>
@@ -1075,6 +1176,11 @@
       </w:numPr>
       <w:contextualSpacing/>
     </w:pPr>
+    <w:rPr>
+      <w:rFonts w:ascii="Times New Roman" w:hAnsi="Times New Roman" w:eastAsia="Times New Roman" w:cs="Times New Roman"/>
+      <w:color w:val="000000"/>
+      <w:sz w:val="24"/>
+    </w:rPr>
   </w:style>
   <w:style w:type="paragraph" w:styleId="ListBullet2">
     <w:name w:val="List Bullet 2"/>
@@ -1088,6 +1194,11 @@
       </w:numPr>
       <w:contextualSpacing/>
     </w:pPr>
+    <w:rPr>
+      <w:rFonts w:ascii="Times New Roman" w:hAnsi="Times New Roman" w:eastAsia="Times New Roman" w:cs="Times New Roman"/>
+      <w:color w:val="000000"/>
+      <w:sz w:val="24"/>
+    </w:rPr>
   </w:style>
   <w:style w:type="paragraph" w:styleId="ListBullet3">
     <w:name w:val="List Bullet 3"/>
@@ -1101,6 +1212,11 @@
       </w:numPr>
       <w:contextualSpacing/>
     </w:pPr>
+    <w:rPr>
+      <w:rFonts w:ascii="Times New Roman" w:hAnsi="Times New Roman" w:eastAsia="Times New Roman" w:cs="Times New Roman"/>
+      <w:color w:val="000000"/>
+      <w:sz w:val="24"/>
+    </w:rPr>
   </w:style>
   <w:style w:type="paragraph" w:styleId="ListNumber">
     <w:name w:val="List Number"/>
@@ -1114,6 +1230,11 @@
       </w:numPr>
       <w:contextualSpacing/>
     </w:pPr>
+    <w:rPr>
+      <w:rFonts w:ascii="Times New Roman" w:hAnsi="Times New Roman" w:eastAsia="Times New Roman" w:cs="Times New Roman"/>
+      <w:color w:val="000000"/>
+      <w:sz w:val="24"/>
+    </w:rPr>
   </w:style>
   <w:style w:type="paragraph" w:styleId="ListNumber2">
     <w:name w:val="List Number 2"/>
@@ -1127,6 +1248,11 @@
       </w:numPr>
       <w:contextualSpacing/>
     </w:pPr>
+    <w:rPr>
+      <w:rFonts w:ascii="Times New Roman" w:hAnsi="Times New Roman" w:eastAsia="Times New Roman" w:cs="Times New Roman"/>
+      <w:color w:val="000000"/>
+      <w:sz w:val="24"/>
+    </w:rPr>
   </w:style>
   <w:style w:type="paragraph" w:styleId="ListNumber3">
     <w:name w:val="List Number 3"/>
@@ -1140,6 +1266,11 @@
       </w:numPr>
       <w:contextualSpacing/>
     </w:pPr>
+    <w:rPr>
+      <w:rFonts w:ascii="Times New Roman" w:hAnsi="Times New Roman" w:eastAsia="Times New Roman" w:cs="Times New Roman"/>
+      <w:color w:val="000000"/>
+      <w:sz w:val="24"/>
+    </w:rPr>
   </w:style>
   <w:style w:type="paragraph" w:styleId="ListContinue">
     <w:name w:val="List Continue"/>
@@ -1152,6 +1283,11 @@
       <w:ind w:left="360"/>
       <w:contextualSpacing/>
     </w:pPr>
+    <w:rPr>
+      <w:rFonts w:ascii="Times New Roman" w:hAnsi="Times New Roman" w:eastAsia="Times New Roman" w:cs="Times New Roman"/>
+      <w:color w:val="000000"/>
+      <w:sz w:val="24"/>
+    </w:rPr>
   </w:style>
   <w:style w:type="paragraph" w:styleId="ListContinue2">
     <w:name w:val="List Continue 2"/>
@@ -1164,6 +1300,11 @@
       <w:ind w:left="720"/>
       <w:contextualSpacing/>
     </w:pPr>
+    <w:rPr>
+      <w:rFonts w:ascii="Times New Roman" w:hAnsi="Times New Roman" w:eastAsia="Times New Roman" w:cs="Times New Roman"/>
+      <w:color w:val="000000"/>
+      <w:sz w:val="24"/>
+    </w:rPr>
   </w:style>
   <w:style w:type="paragraph" w:styleId="ListContinue3">
     <w:name w:val="List Continue 3"/>
@@ -1176,6 +1317,11 @@
       <w:ind w:left="1080"/>
       <w:contextualSpacing/>
     </w:pPr>
+    <w:rPr>
+      <w:rFonts w:ascii="Times New Roman" w:hAnsi="Times New Roman" w:eastAsia="Times New Roman" w:cs="Times New Roman"/>
+      <w:color w:val="000000"/>
+      <w:sz w:val="24"/>
+    </w:rPr>
   </w:style>
   <w:style w:type="paragraph" w:styleId="MacroText">
     <w:name w:val="macro"/>
@@ -1195,8 +1341,9 @@
       </w:tabs>
     </w:pPr>
     <w:rPr>
-      <w:rFonts w:ascii="Courier" w:hAnsi="Courier"/>
-      <w:sz w:val="20"/>
+      <w:rFonts w:ascii="Times New Roman" w:hAnsi="Times New Roman" w:eastAsia="Times New Roman" w:cs="Times New Roman"/>
+      <w:color w:val="000000"/>
+      <w:sz w:val="24"/>
       <w:szCs w:val="20"/>
     </w:rPr>
   </w:style>
@@ -1207,8 +1354,9 @@
     <w:uiPriority w:val="99"/>
     <w:rsid w:val="0029639D"/>
     <w:rPr>
-      <w:rFonts w:ascii="Courier" w:hAnsi="Courier"/>
-      <w:sz w:val="20"/>
+      <w:rFonts w:ascii="Times New Roman" w:hAnsi="Times New Roman" w:eastAsia="Times New Roman" w:cs="Times New Roman"/>
+      <w:color w:val="000000"/>
+      <w:sz w:val="24"/>
       <w:szCs w:val="20"/>
     </w:rPr>
   </w:style>
@@ -1221,9 +1369,11 @@
     <w:qFormat/>
     <w:rsid w:val="00FC693F"/>
     <w:rPr>
+      <w:rFonts w:ascii="Times New Roman" w:hAnsi="Times New Roman" w:eastAsia="Times New Roman" w:cs="Times New Roman"/>
       <w:i/>
       <w:iCs/>
-      <w:color w:val="000000" w:themeColor="text1"/>
+      <w:color w:val="000000"/>
+      <w:sz w:val="24"/>
     </w:rPr>
   </w:style>
   <w:style w:type="character" w:customStyle="1" w:styleId="QuoteChar">
@@ -1233,9 +1383,11 @@
     <w:uiPriority w:val="29"/>
     <w:rsid w:val="00FC693F"/>
     <w:rPr>
+      <w:rFonts w:ascii="Times New Roman" w:hAnsi="Times New Roman" w:eastAsia="Times New Roman" w:cs="Times New Roman"/>
       <w:i/>
       <w:iCs/>
-      <w:color w:val="000000" w:themeColor="text1"/>
+      <w:color w:val="000000"/>
+      <w:sz w:val="24"/>
     </w:rPr>
   </w:style>
   <w:style w:type="character" w:customStyle="1" w:styleId="Heading4Char">
@@ -1246,12 +1398,13 @@
     <w:semiHidden/>
     <w:rsid w:val="00FC693F"/>
     <w:rPr>
-      <w:rFonts w:asciiTheme="majorHAnsi" w:eastAsiaTheme="majorEastAsia" w:hAnsiTheme="majorHAnsi" w:cstheme="majorBidi"/>
+      <w:rFonts w:asciiTheme="majorHAnsi" w:eastAsiaTheme="majorEastAsia" w:hAnsiTheme="majorHAnsi" w:cstheme="majorBidi" w:ascii="Times New Roman" w:hAnsi="Times New Roman" w:eastAsia="Times New Roman" w:cs="Times New Roman"/>
       <w:b/>
       <w:bCs/>
       <w:i/>
       <w:iCs/>
-      <w:color w:val="4F81BD" w:themeColor="accent1"/>
+      <w:color w:val="000000"/>
+      <w:sz w:val="24"/>
     </w:rPr>
   </w:style>
   <w:style w:type="character" w:customStyle="1" w:styleId="Heading5Char">
@@ -1262,8 +1415,9 @@
     <w:semiHidden/>
     <w:rsid w:val="00FC693F"/>
     <w:rPr>
-      <w:rFonts w:asciiTheme="majorHAnsi" w:eastAsiaTheme="majorEastAsia" w:hAnsiTheme="majorHAnsi" w:cstheme="majorBidi"/>
-      <w:color w:val="243F60" w:themeColor="accent1" w:themeShade="7F"/>
+      <w:rFonts w:asciiTheme="majorHAnsi" w:eastAsiaTheme="majorEastAsia" w:hAnsiTheme="majorHAnsi" w:cstheme="majorBidi" w:ascii="Times New Roman" w:hAnsi="Times New Roman" w:eastAsia="Times New Roman" w:cs="Times New Roman"/>
+      <w:color w:val="000000"/>
+      <w:sz w:val="24"/>
     </w:rPr>
   </w:style>
   <w:style w:type="character" w:customStyle="1" w:styleId="Heading6Char">
@@ -1274,10 +1428,11 @@
     <w:semiHidden/>
     <w:rsid w:val="00FC693F"/>
     <w:rPr>
-      <w:rFonts w:asciiTheme="majorHAnsi" w:eastAsiaTheme="majorEastAsia" w:hAnsiTheme="majorHAnsi" w:cstheme="majorBidi"/>
+      <w:rFonts w:asciiTheme="majorHAnsi" w:eastAsiaTheme="majorEastAsia" w:hAnsiTheme="majorHAnsi" w:cstheme="majorBidi" w:ascii="Times New Roman" w:hAnsi="Times New Roman" w:eastAsia="Times New Roman" w:cs="Times New Roman"/>
       <w:i/>
       <w:iCs/>
-      <w:color w:val="243F60" w:themeColor="accent1" w:themeShade="7F"/>
+      <w:color w:val="000000"/>
+      <w:sz w:val="24"/>
     </w:rPr>
   </w:style>
   <w:style w:type="character" w:customStyle="1" w:styleId="Heading7Char">
@@ -1288,10 +1443,11 @@
     <w:semiHidden/>
     <w:rsid w:val="00FC693F"/>
     <w:rPr>
-      <w:rFonts w:asciiTheme="majorHAnsi" w:eastAsiaTheme="majorEastAsia" w:hAnsiTheme="majorHAnsi" w:cstheme="majorBidi"/>
+      <w:rFonts w:asciiTheme="majorHAnsi" w:eastAsiaTheme="majorEastAsia" w:hAnsiTheme="majorHAnsi" w:cstheme="majorBidi" w:ascii="Times New Roman" w:hAnsi="Times New Roman" w:eastAsia="Times New Roman" w:cs="Times New Roman"/>
       <w:i/>
       <w:iCs/>
-      <w:color w:val="404040" w:themeColor="text1" w:themeTint="BF"/>
+      <w:color w:val="000000"/>
+      <w:sz w:val="24"/>
     </w:rPr>
   </w:style>
   <w:style w:type="character" w:customStyle="1" w:styleId="Heading8Char">
@@ -1302,9 +1458,9 @@
     <w:semiHidden/>
     <w:rsid w:val="00FC693F"/>
     <w:rPr>
-      <w:rFonts w:asciiTheme="majorHAnsi" w:eastAsiaTheme="majorEastAsia" w:hAnsiTheme="majorHAnsi" w:cstheme="majorBidi"/>
-      <w:color w:val="4F81BD" w:themeColor="accent1"/>
-      <w:sz w:val="20"/>
+      <w:rFonts w:asciiTheme="majorHAnsi" w:eastAsiaTheme="majorEastAsia" w:hAnsiTheme="majorHAnsi" w:cstheme="majorBidi" w:ascii="Times New Roman" w:hAnsi="Times New Roman" w:eastAsia="Times New Roman" w:cs="Times New Roman"/>
+      <w:color w:val="000000"/>
+      <w:sz w:val="24"/>
       <w:szCs w:val="20"/>
     </w:rPr>
   </w:style>
@@ -1316,11 +1472,11 @@
     <w:semiHidden/>
     <w:rsid w:val="00FC693F"/>
     <w:rPr>
-      <w:rFonts w:asciiTheme="majorHAnsi" w:eastAsiaTheme="majorEastAsia" w:hAnsiTheme="majorHAnsi" w:cstheme="majorBidi"/>
+      <w:rFonts w:asciiTheme="majorHAnsi" w:eastAsiaTheme="majorEastAsia" w:hAnsiTheme="majorHAnsi" w:cstheme="majorBidi" w:ascii="Times New Roman" w:hAnsi="Times New Roman" w:eastAsia="Times New Roman" w:cs="Times New Roman"/>
       <w:i/>
       <w:iCs/>
-      <w:color w:val="404040" w:themeColor="text1" w:themeTint="BF"/>
-      <w:sz w:val="20"/>
+      <w:color w:val="000000"/>
+      <w:sz w:val="24"/>
       <w:szCs w:val="20"/>
     </w:rPr>
   </w:style>
@@ -1337,10 +1493,11 @@
       <w:spacing w:line="240" w:lineRule="auto"/>
     </w:pPr>
     <w:rPr>
+      <w:rFonts w:ascii="Times New Roman" w:hAnsi="Times New Roman" w:eastAsia="Times New Roman" w:cs="Times New Roman"/>
       <w:b/>
       <w:bCs/>
-      <w:color w:val="4F81BD" w:themeColor="accent1"/>
-      <w:sz w:val="18"/>
+      <w:color w:val="000000"/>
+      <w:sz w:val="24"/>
       <w:szCs w:val="18"/>
     </w:rPr>
   </w:style>
@@ -1351,8 +1508,11 @@
     <w:qFormat/>
     <w:rsid w:val="00FC693F"/>
     <w:rPr>
+      <w:rFonts w:ascii="Times New Roman" w:hAnsi="Times New Roman" w:eastAsia="Times New Roman" w:cs="Times New Roman"/>
       <w:b/>
       <w:bCs/>
+      <w:color w:val="000000"/>
+      <w:sz w:val="24"/>
     </w:rPr>
   </w:style>
   <w:style w:type="character" w:styleId="Emphasis">
@@ -1362,8 +1522,11 @@
     <w:qFormat/>
     <w:rsid w:val="00FC693F"/>
     <w:rPr>
+      <w:rFonts w:ascii="Times New Roman" w:hAnsi="Times New Roman" w:eastAsia="Times New Roman" w:cs="Times New Roman"/>
       <w:i/>
       <w:iCs/>
+      <w:color w:val="000000"/>
+      <w:sz w:val="24"/>
     </w:rPr>
   </w:style>
   <w:style w:type="paragraph" w:styleId="IntenseQuote">
@@ -1382,11 +1545,13 @@
       <w:ind w:left="936" w:right="936"/>
     </w:pPr>
     <w:rPr>
+      <w:rFonts w:ascii="Times New Roman" w:hAnsi="Times New Roman" w:eastAsia="Times New Roman" w:cs="Times New Roman"/>
       <w:b/>
       <w:bCs/>
       <w:i/>
       <w:iCs/>
-      <w:color w:val="4F81BD" w:themeColor="accent1"/>
+      <w:color w:val="000000"/>
+      <w:sz w:val="24"/>
     </w:rPr>
   </w:style>
   <w:style w:type="character" w:customStyle="1" w:styleId="IntenseQuoteChar">
@@ -1396,11 +1561,13 @@
     <w:uiPriority w:val="30"/>
     <w:rsid w:val="00FC693F"/>
     <w:rPr>
+      <w:rFonts w:ascii="Times New Roman" w:hAnsi="Times New Roman" w:eastAsia="Times New Roman" w:cs="Times New Roman"/>
       <w:b/>
       <w:bCs/>
       <w:i/>
       <w:iCs/>
-      <w:color w:val="4F81BD" w:themeColor="accent1"/>
+      <w:color w:val="000000"/>
+      <w:sz w:val="24"/>
     </w:rPr>
   </w:style>
   <w:style w:type="character" w:styleId="SubtleEmphasis">
@@ -1410,9 +1577,11 @@
     <w:qFormat/>
     <w:rsid w:val="00FC693F"/>
     <w:rPr>
+      <w:rFonts w:ascii="Times New Roman" w:hAnsi="Times New Roman" w:eastAsia="Times New Roman" w:cs="Times New Roman"/>
       <w:i/>
       <w:iCs/>
-      <w:color w:val="808080" w:themeColor="text1" w:themeTint="7F"/>
+      <w:color w:val="000000"/>
+      <w:sz w:val="24"/>
     </w:rPr>
   </w:style>
   <w:style w:type="character" w:styleId="IntenseEmphasis">
@@ -1422,11 +1591,13 @@
     <w:qFormat/>
     <w:rsid w:val="00FC693F"/>
     <w:rPr>
+      <w:rFonts w:ascii="Times New Roman" w:hAnsi="Times New Roman" w:eastAsia="Times New Roman" w:cs="Times New Roman"/>
       <w:b/>
       <w:bCs/>
       <w:i/>
       <w:iCs/>
-      <w:color w:val="4F81BD" w:themeColor="accent1"/>
+      <w:color w:val="000000"/>
+      <w:sz w:val="24"/>
     </w:rPr>
   </w:style>
   <w:style w:type="character" w:styleId="SubtleReference">
@@ -1436,8 +1607,10 @@
     <w:qFormat/>
     <w:rsid w:val="00FC693F"/>
     <w:rPr>
+      <w:rFonts w:ascii="Times New Roman" w:hAnsi="Times New Roman" w:eastAsia="Times New Roman" w:cs="Times New Roman"/>
       <w:smallCaps/>
-      <w:color w:val="C0504D" w:themeColor="accent2"/>
+      <w:color w:val="000000"/>
+      <w:sz w:val="24"/>
       <w:u w:val="single"/>
     </w:rPr>
   </w:style>
@@ -1448,11 +1621,13 @@
     <w:qFormat/>
     <w:rsid w:val="00FC693F"/>
     <w:rPr>
+      <w:rFonts w:ascii="Times New Roman" w:hAnsi="Times New Roman" w:eastAsia="Times New Roman" w:cs="Times New Roman"/>
       <w:b/>
       <w:bCs/>
       <w:smallCaps/>
-      <w:color w:val="C0504D" w:themeColor="accent2"/>
+      <w:color w:val="000000"/>
       <w:spacing w:val="5"/>
+      <w:sz w:val="24"/>
       <w:u w:val="single"/>
     </w:rPr>
   </w:style>
@@ -1463,10 +1638,13 @@
     <w:qFormat/>
     <w:rsid w:val="00FC693F"/>
     <w:rPr>
+      <w:rFonts w:ascii="Times New Roman" w:hAnsi="Times New Roman" w:eastAsia="Times New Roman" w:cs="Times New Roman"/>
       <w:b/>
       <w:bCs/>
       <w:smallCaps/>
+      <w:color w:val="000000"/>
       <w:spacing w:val="5"/>
+      <w:sz w:val="24"/>
     </w:rPr>
   </w:style>
   <w:style w:type="paragraph" w:styleId="TOCHeading">
@@ -1481,6 +1659,11 @@
     <w:pPr>
       <w:outlineLvl w:val="9"/>
     </w:pPr>
+    <w:rPr>
+      <w:rFonts w:ascii="Times New Roman" w:hAnsi="Times New Roman" w:eastAsia="Times New Roman" w:cs="Times New Roman"/>
+      <w:color w:val="000000"/>
+      <w:sz w:val="24"/>
+    </w:rPr>
   </w:style>
   <w:style w:type="table" w:styleId="TableGrid">
     <w:name w:val="Table Grid"/>

</xml_diff>